<commit_message>
Align Report 05 relation family across Green Papers
</commit_message>
<xml_diff>
--- a/papers/the-spiral-of-hypotheses-full-register.docx
+++ b/papers/the-spiral-of-hypotheses-full-register.docx
@@ -56,7 +56,7 @@
         <w:spacing w:after="360"/>
       </w:pPr>
       <w:r>
-        <w:t>Public working register · v0.8 · 5 September 2026 · updated through Green Paper 23</w:t>
+        <w:t>Public working register · v0.8.1 · 14 September 2026 · updated through Green Paper 23</w:t>
       </w:r>
     </w:p>
     <w:p>
@@ -105,7 +105,21 @@
         <w:pStyle w:val="Heading1"/>
       </w:pPr>
       <w:r>
-        <w:t>v0.8 publication change note</w:t>
+        <w:t>v0.8.1 publication change note</w:t>
+      </w:r>
+    </w:p>
+    <w:p>
+      <w:pPr>
+        <w:pStyle w:val="ListBullet"/>
+      </w:pPr>
+      <w:r>
+        <w:rPr>
+          <w:b/>
+        </w:rPr>
+        <w:t>Relation-form alignment.</w:t>
+      </w:r>
+      <w:r>
+        <w:t xml:space="preserve"> Updates H54 and the Vocabulary Atlas to the four parallel forms in Report 05 v0.3.2 while preserving the burden test, distributed-capacity condition, flow condition, H-number and falsification test.</w:t>
       </w:r>
     </w:p>
     <w:p>
@@ -3664,7 +3678,7 @@
           <w:rFonts w:ascii="Aptos" w:hAnsi="Aptos"/>
           <w:color w:val="1F1D19"/>
         </w:rPr>
-        <w:t xml:space="preserve"> "If 10,000 more people did this tomorrow, would the centre become heavier?" Maturity must create distributed capacities, not a progressively heavier centre. </w:t>
+        <w:t xml:space="preserve"> "If 10,000 more people did this tomorrow, would the centre become heavier?" Independent practice is complete in itself. Help need not be earned through a prescribed journey, and support requires its own agreement, mandate and carrying capacity. The design should distribute capacity rather than make the centre progressively heavier. Flow must not arrive faster than the living system can absorb without distortion. </w:t>
       </w:r>
       <w:r>
         <w:rPr>
@@ -3672,14 +3686,14 @@
           <w:i/>
           <w:color w:val="1F1D19"/>
         </w:rPr>
-        <w:t>First stand, then help.</w:t>
-      </w:r>
-      <w:r>
-        <w:rPr>
-          <w:rFonts w:ascii="Aptos" w:hAnsi="Aptos"/>
-          <w:color w:val="1F1D19"/>
-        </w:rPr>
-        <w:t xml:space="preserve"> Flow must not arrive faster than the living system can absorb without distortion. </w:t>
+        <w:t/>
+      </w:r>
+      <w:r>
+        <w:rPr>
+          <w:rFonts w:ascii="Aptos" w:hAnsi="Aptos"/>
+          <w:color w:val="1F1D19"/>
+        </w:rPr>
+        <w:t xml:space="preserve"/>
       </w:r>
       <w:r>
         <w:rPr>
@@ -3687,7 +3701,7 @@
           <w:i/>
           <w:color w:val="1F1D19"/>
         </w:rPr>
-        <w:t>SRIP Report 05 (v0.2).</w:t>
+        <w:t>Report 05 — The Steward’s Journey (v0.3.2).</w:t>
       </w:r>
       <w:r>
         <w:rPr>
@@ -6582,7 +6596,7 @@
           <w:rFonts w:ascii="Aptos" w:hAnsi="Aptos"/>
           <w:color w:val="1F1D19"/>
         </w:rPr>
-        <w:t xml:space="preserve"> If 10,000 more people did this tomorrow, would the centre become heavier? Maturity distributes capacity rather than accumulating intake at the centre.</w:t>
+        <w:t xml:space="preserve"> If 10,000 more people did this tomorrow, would the centre become heavier? The design distributes capacity rather than accumulating intake at the centre; independent practice remains complete, and support keeps its own agreement and mandate.</w:t>
       </w:r>
     </w:p>
     <w:p>
@@ -6907,7 +6921,7 @@
       <w:jc w:val="right"/>
     </w:pPr>
     <w:r>
-      <w:t>Public working register · v0.8 · 5 September 2026</w:t>
+      <w:t>Public working register · v0.8.1 · 14 September 2026</w:t>
     </w:r>
   </w:p>
 </w:ftr>
@@ -6920,7 +6934,7 @@
       <w:pStyle w:val="Footer"/>
     </w:pPr>
     <w:r>
-      <w:t>Public working register · v0.8 · 5 September 2026</w:t>
+      <w:t>Public working register · v0.8.1 · 14 September 2026</w:t>
     </w:r>
   </w:p>
 </w:ftr>

</xml_diff>

<commit_message>
Align Report 05 family across Green Papers
Publish the reviewed Report 05 convergence family: four parallel relation forms, version and pointer alignment, regenerated PDFs, and the updated hypothesis register.
</commit_message>
<xml_diff>
--- a/papers/the-spiral-of-hypotheses-full-register.docx
+++ b/papers/the-spiral-of-hypotheses-full-register.docx
@@ -56,7 +56,7 @@
         <w:spacing w:after="360"/>
       </w:pPr>
       <w:r>
-        <w:t>Public working register · v0.8 · 5 September 2026 · updated through Green Paper 23</w:t>
+        <w:t>Public working register · v0.8.1 · 14 September 2026 · updated through Green Paper 23</w:t>
       </w:r>
     </w:p>
     <w:p>
@@ -105,7 +105,21 @@
         <w:pStyle w:val="Heading1"/>
       </w:pPr>
       <w:r>
-        <w:t>v0.8 publication change note</w:t>
+        <w:t>v0.8.1 publication change note</w:t>
+      </w:r>
+    </w:p>
+    <w:p>
+      <w:pPr>
+        <w:pStyle w:val="ListBullet"/>
+      </w:pPr>
+      <w:r>
+        <w:rPr>
+          <w:b/>
+        </w:rPr>
+        <w:t>Relation-form alignment.</w:t>
+      </w:r>
+      <w:r>
+        <w:t xml:space="preserve"> Updates H54 and the Vocabulary Atlas to the four parallel forms in Report 05 v0.3.2 while preserving the burden test, distributed-capacity condition, flow condition, H-number and falsification test.</w:t>
       </w:r>
     </w:p>
     <w:p>
@@ -3664,7 +3678,7 @@
           <w:rFonts w:ascii="Aptos" w:hAnsi="Aptos"/>
           <w:color w:val="1F1D19"/>
         </w:rPr>
-        <w:t xml:space="preserve"> "If 10,000 more people did this tomorrow, would the centre become heavier?" Maturity must create distributed capacities, not a progressively heavier centre. </w:t>
+        <w:t xml:space="preserve"> "If 10,000 more people did this tomorrow, would the centre become heavier?" Independent practice is complete in itself. Help need not be earned through a prescribed journey, and support requires its own agreement, mandate and carrying capacity. The design should distribute capacity rather than make the centre progressively heavier. Flow must not arrive faster than the living system can absorb without distortion. </w:t>
       </w:r>
       <w:r>
         <w:rPr>
@@ -3672,14 +3686,14 @@
           <w:i/>
           <w:color w:val="1F1D19"/>
         </w:rPr>
-        <w:t>First stand, then help.</w:t>
-      </w:r>
-      <w:r>
-        <w:rPr>
-          <w:rFonts w:ascii="Aptos" w:hAnsi="Aptos"/>
-          <w:color w:val="1F1D19"/>
-        </w:rPr>
-        <w:t xml:space="preserve"> Flow must not arrive faster than the living system can absorb without distortion. </w:t>
+        <w:t/>
+      </w:r>
+      <w:r>
+        <w:rPr>
+          <w:rFonts w:ascii="Aptos" w:hAnsi="Aptos"/>
+          <w:color w:val="1F1D19"/>
+        </w:rPr>
+        <w:t xml:space="preserve"/>
       </w:r>
       <w:r>
         <w:rPr>
@@ -3687,7 +3701,7 @@
           <w:i/>
           <w:color w:val="1F1D19"/>
         </w:rPr>
-        <w:t>SRIP Report 05 (v0.2).</w:t>
+        <w:t>Report 05 — The Steward’s Journey (v0.3.2).</w:t>
       </w:r>
       <w:r>
         <w:rPr>
@@ -6582,7 +6596,7 @@
           <w:rFonts w:ascii="Aptos" w:hAnsi="Aptos"/>
           <w:color w:val="1F1D19"/>
         </w:rPr>
-        <w:t xml:space="preserve"> If 10,000 more people did this tomorrow, would the centre become heavier? Maturity distributes capacity rather than accumulating intake at the centre.</w:t>
+        <w:t xml:space="preserve"> If 10,000 more people did this tomorrow, would the centre become heavier? The design distributes capacity rather than accumulating intake at the centre; independent practice remains complete, and support keeps its own agreement and mandate.</w:t>
       </w:r>
     </w:p>
     <w:p>
@@ -6907,7 +6921,7 @@
       <w:jc w:val="right"/>
     </w:pPr>
     <w:r>
-      <w:t>Public working register · v0.8 · 5 September 2026</w:t>
+      <w:t>Public working register · v0.8.1 · 14 September 2026</w:t>
     </w:r>
   </w:p>
 </w:ftr>
@@ -6920,7 +6934,7 @@
       <w:pStyle w:val="Footer"/>
     </w:pPr>
     <w:r>
-      <w:t>Public working register · v0.8 · 5 September 2026</w:t>
+      <w:t>Public working register · v0.8.1 · 14 September 2026</w:t>
     </w:r>
   </w:p>
 </w:ftr>

</xml_diff>

<commit_message>
Update Full Working Register references to v0.8.2
</commit_message>
<xml_diff>
--- a/papers/the-spiral-of-hypotheses-full-register.docx
+++ b/papers/the-spiral-of-hypotheses-full-register.docx
@@ -56,7 +56,7 @@
         <w:spacing w:after="360"/>
       </w:pPr>
       <w:r>
-        <w:t>Public working register · v0.8.1 · 14 September 2026 · updated through Green Paper 23</w:t>
+        <w:t>Public working register · v0.8.2 · 17 September 2026 · updated through Green Paper 23</w:t>
       </w:r>
     </w:p>
     <w:p>
@@ -105,25 +105,44 @@
         <w:pStyle w:val="Heading1"/>
       </w:pPr>
       <w:r>
-        <w:t>v0.8.1 publication change note</w:t>
+        <w:t>v0.8.2 reference correction note</w:t>
       </w:r>
     </w:p>
     <w:p>
-      <w:pPr>
-        <w:pStyle w:val="ListBullet"/>
-      </w:pPr>
       <w:r>
         <w:rPr>
           <w:b/>
         </w:rPr>
-        <w:t>Relation-form alignment.</w:t>
-      </w:r>
-      <w:r>
-        <w:t xml:space="preserve"> Updates H54 and the Vocabulary Atlas to the four parallel forms in Report 05 v0.3.2 while preserving the burden test, distributed-capacity condition, flow condition, H-number and falsification test.</w:t>
+        <w:t>Bounded correction.</w:t>
+      </w:r>
+      <w:r>
+        <w:t xml:space="preserve"> Updates the register’s current source references to Report 03 v0.4.1, Report 06 v0.8.1, and GP23 candidate v0.2.1. No hypothesis wording, numbering, derivation, or status is changed.</w:t>
       </w:r>
     </w:p>
     <w:p>
       <w:pPr>
+        <w:pStyle w:val="Heading1"/>
+      </w:pPr>
+      <w:r>
+        <w:t>v0.8.1 publication change note</w:t>
+      </w:r>
+    </w:p>
+    <w:p>
+      <w:pPr>
+        <w:pStyle w:val="ListBullet"/>
+      </w:pPr>
+      <w:r>
+        <w:rPr>
+          <w:b/>
+        </w:rPr>
+        <w:t>Relation-form alignment.</w:t>
+      </w:r>
+      <w:r>
+        <w:t xml:space="preserve"> Updates H54 and the Vocabulary Atlas to the four parallel forms in Report 05 v0.3.2 while preserving the burden test, distributed-capacity condition, flow condition, H-number and falsification test.</w:t>
+      </w:r>
+    </w:p>
+    <w:p>
+      <w:pPr>
         <w:pStyle w:val="ListBullet"/>
       </w:pPr>
       <w:r>
@@ -185,13 +204,13 @@
           <w:b/>
           <w:i w:val="0"/>
         </w:rPr>
-        <w:t xml:space="preserve">Current references. </w:t>
+        <w:t xml:space="preserve">Reference state at v0.8. </w:t>
       </w:r>
       <w:r>
         <w:rPr>
           <w:i w:val="0"/>
         </w:rPr>
-        <w:t>Updates Report 03 to v0.3 and Report 06 to v0.5, retains GP23 as candidate v0.2, and identifies legal reference points that require current jurisdiction-specific verification before formal use.</w:t>
+        <w:t>At that publication, the register recorded Report 03 at v0.3, Report 06 at v0.5, and GP23 at candidate v0.2. These pointers are superseded by the v0.8.2 reference correction above; the legal-verification qualification remains unchanged.</w:t>
       </w:r>
     </w:p>
     <w:p>
@@ -1133,7 +1152,7 @@
           <w:i/>
           <w:color w:val="1F1D19"/>
         </w:rPr>
-        <w:t>GP23 A Decent Economy Under the Jurisdiction of Life (candidate v0.2).</w:t>
+        <w:t>GP23 A Decent Economy Under the Jurisdiction of Life (candidate v0.2.1).</w:t>
       </w:r>
     </w:p>
     <w:p>
@@ -2452,7 +2471,7 @@
         <w:rPr>
           <w:i w:val="0"/>
         </w:rPr>
-        <w:t xml:space="preserve"> Building governance without flow architecture is building a house with no water. Report 03 Water Into Dry Riverbeds (v0.3); Report 06 Regenerative Reciprocity (v0.5). Operational reading: money follows least resistance to the most powerful actor unless membranes redirect it. Correction: regenerative fields thriving long-term under ordinary project-cycle funding.</w:t>
+        <w:t xml:space="preserve"> Building governance without flow architecture is building a house with no water. Report 03 Water Into Dry Riverbeds (v0.4.1); Report 06 Regenerative Reciprocity (v0.8.1). Operational reading: money follows least resistance to the most powerful actor unless membranes redirect it. Correction: regenerative fields thriving long-term under ordinary project-cycle funding.</w:t>
       </w:r>
     </w:p>
     <w:p>
@@ -6921,7 +6940,7 @@
       <w:jc w:val="right"/>
     </w:pPr>
     <w:r>
-      <w:t>Public working register · v0.8.1 · 14 September 2026</w:t>
+      <w:t>Public working register · v0.8.2 · 17 September 2026</w:t>
     </w:r>
   </w:p>
 </w:ftr>
@@ -6934,7 +6953,7 @@
       <w:pStyle w:val="Footer"/>
     </w:pPr>
     <w:r>
-      <w:t>Public working register · v0.8.1 · 14 September 2026</w:t>
+      <w:t>Public working register · v0.8.2 · 17 September 2026</w:t>
     </w:r>
   </w:p>
 </w:ftr>

</xml_diff>

<commit_message>
Align Papers editorial revisions across HTML, PDF and Word
</commit_message>
<xml_diff>
--- a/papers/the-spiral-of-hypotheses-full-register.docx
+++ b/papers/the-spiral-of-hypotheses-full-register.docx
@@ -56,7 +56,7 @@
         <w:spacing w:after="360"/>
       </w:pPr>
       <w:r>
-        <w:t>Public working register · v0.8.2 · 17 September 2026 · updated through Green Paper 23</w:t>
+        <w:t>Public working register · v0.8.3 · 11 October 2026 · updated through Green Paper 23</w:t>
       </w:r>
     </w:p>
     <w:p>
@@ -1785,26 +1785,18 @@
       </w:pPr>
       <w:r>
         <w:rPr>
-          <w:rFonts w:ascii="Aptos" w:hAnsi="Aptos"/>
           <w:b/>
-          <w:color w:val="1F1D19"/>
-        </w:rPr>
-        <w:t>H11 — Capacity before consent.</w:t>
-      </w:r>
-      <w:r>
-        <w:rPr>
-          <w:rFonts w:ascii="Aptos" w:hAnsi="Aptos"/>
-          <w:color w:val="1F1D19"/>
-        </w:rPr>
-        <w:t xml:space="preserve"> Consent is meaningful only when the nervous system is regulated; under threat, bodies comply without choosing. </w:t>
-      </w:r>
-      <w:r>
-        <w:rPr>
-          <w:rFonts w:ascii="Aptos" w:hAnsi="Aptos"/>
+        </w:rPr>
+        <w:t xml:space="preserve">H11 — Capacity can widen the space for consent; rights remain under strain.</w:t>
+      </w:r>
+      <w:r>
+        <w:t xml:space="preserve"> Regulation and material safety can make choice more credible. Under threat, compliance may be mistaken for consent, but dysregulation does not remove a person’s dignity, voice, consent or authority over their own boundaries. Regulation must not become an entrance requirement for being heard. Sources: GP16 Nervous-System Love (v0.2); GP13 §4; GP18. </w:t>
+      </w:r>
+      <w:r>
+        <w:rPr>
           <w:i/>
-          <w:color w:val="1F1D19"/>
-        </w:rPr>
-        <w:t>GP16. Correction: freely-chosen durable consent given from acute dysregulation.</w:t>
+        </w:rPr>
+        <w:t xml:space="preserve">Correction: measures intended to support capacity making refusal harder, excluding people under strain, or increasing coercion rather than credible choice.</w:t>
       </w:r>
     </w:p>
     <w:p>
@@ -5348,18 +5340,12 @@
       </w:pPr>
       <w:r>
         <w:rPr>
-          <w:rFonts w:ascii="Aptos" w:hAnsi="Aptos"/>
           <w:b/>
-          <w:color w:val="1F1D19"/>
-        </w:rPr>
-        <w:t>AnchorPoint — current public term.</w:t>
-      </w:r>
-      <w:r>
-        <w:rPr>
-          <w:rFonts w:ascii="Aptos" w:hAnsi="Aptos"/>
-          <w:color w:val="1F1D19"/>
-        </w:rPr>
-        <w:t xml:space="preserve"> A real person, group or relationship rooted in place with enough continuity for another conversation. It is a relational threshold, not proof of an active field cycle.</w:t>
+        </w:rPr>
+        <w:t xml:space="preserve">AnchorPoint — current public term.</w:t>
+      </w:r>
+      <w:r>
+        <w:t xml:space="preserve"> An AnchorPoint is a locally rooted shared form through which people, places and regenerative processes may become connected over time through shared stewardship, learning, governance and Return. A rooted relationship may choose to develop such a form; a person or contact is not in itself an AnchorPoint. The form does not automatically activate a field cycle.</w:t>
       </w:r>
     </w:p>
     <w:p>
@@ -5368,18 +5354,12 @@
       </w:pPr>
       <w:r>
         <w:rPr>
-          <w:rFonts w:ascii="Aptos" w:hAnsi="Aptos"/>
           <w:b/>
-          <w:color w:val="1F1D19"/>
-        </w:rPr>
-        <w:t>Field node — current architectural term.</w:t>
-      </w:r>
-      <w:r>
-        <w:rPr>
-          <w:rFonts w:ascii="Aptos" w:hAnsi="Aptos"/>
-          <w:color w:val="1F1D19"/>
-        </w:rPr>
-        <w:t xml:space="preserve"> A place-based node in the wider web; broader than the relational threshold named by AnchorPoint.</w:t>
+        </w:rPr>
+        <w:t xml:space="preserve">Field node — current architectural term.</w:t>
+      </w:r>
+      <w:r>
+        <w:t xml:space="preserve"> A place-based node in the wider web. An AnchorPoint names a locally rooted shared form; an established relationship alone is neither that form nor an active field cycle.</w:t>
       </w:r>
     </w:p>
     <w:p>
@@ -6940,7 +6920,7 @@
       <w:jc w:val="right"/>
     </w:pPr>
     <w:r>
-      <w:t>Public working register · v0.8.2 · 17 September 2026</w:t>
+      <w:t>Public working register · v0.8.3 · 11 October 2026</w:t>
     </w:r>
   </w:p>
 </w:ftr>
@@ -6953,7 +6933,7 @@
       <w:pStyle w:val="Footer"/>
     </w:pPr>
     <w:r>
-      <w:t>Public working register · v0.8.2 · 17 September 2026</w:t>
+      <w:t>Public working register · v0.8.3 · 11 October 2026</w:t>
     </w:r>
   </w:p>
 </w:ftr>

</xml_diff>